<commit_message>
Site updated: 2022-05-23 16:03:14
</commit_message>
<xml_diff>
--- a/images/TongJiFaYaLv.docx
+++ b/images/TongJiFaYaLv.docx
@@ -1,19 +1,19 @@
 
 <file path=word/document.xml><?xml version="1.0" encoding="utf-8"?>
-<w:document xmlns:wpc="http://schemas.microsoft.com/office/word/2010/wordprocessingCanvas" xmlns:cx="http://schemas.microsoft.com/office/drawing/2014/chartex" xmlns:cx1="http://schemas.microsoft.com/office/drawing/2015/9/8/chartex" xmlns:cx2="http://schemas.microsoft.com/office/drawing/2015/10/21/chartex" xmlns:cx3="http://schemas.microsoft.com/office/drawing/2016/5/9/chartex" xmlns:cx4="http://schemas.microsoft.com/office/drawing/2016/5/10/chartex" xmlns:cx5="http://schemas.microsoft.com/office/drawing/2016/5/11/chartex" xmlns:cx6="http://schemas.microsoft.com/office/drawing/2016/5/12/chartex" xmlns:cx7="http://schemas.microsoft.com/office/drawing/2016/5/13/chartex" xmlns:cx8="http://schemas.microsoft.com/office/drawing/2016/5/14/chartex" xmlns:mc="http://schemas.openxmlformats.org/markup-compatibility/2006" xmlns:aink="http://schemas.microsoft.com/office/drawing/2016/ink" xmlns:am3d="http://schemas.microsoft.com/office/drawing/2017/model3d" xmlns:o="urn:schemas-microsoft-com:office:office" xmlns:r="http://schemas.openxmlformats.org/officeDocument/2006/relationships" xmlns:m="http://schemas.openxmlformats.org/officeDocument/2006/math" xmlns:v="urn:schemas-microsoft-com:vml" xmlns:wp14="http://schemas.microsoft.com/office/word/2010/wordprocessingDrawing" xmlns:wp="http://schemas.openxmlformats.org/drawingml/2006/wordprocessingDrawing" xmlns:w10="urn:schemas-microsoft-com:office:word" xmlns:w="http://schemas.openxmlformats.org/wordprocessingml/2006/main" xmlns:w14="http://schemas.microsoft.com/office/word/2010/wordml" xmlns:w15="http://schemas.microsoft.com/office/word/2012/wordml" xmlns:w16cex="http://schemas.microsoft.com/office/word/2018/wordml/cex" xmlns:w16cid="http://schemas.microsoft.com/office/word/2016/wordml/cid" xmlns:w16="http://schemas.microsoft.com/office/word/2018/wordml" xmlns:w16sdtdh="http://schemas.microsoft.com/office/word/2020/wordml/sdtdatahash" xmlns:w16se="http://schemas.microsoft.com/office/word/2015/wordml/symex" xmlns:wpg="http://schemas.microsoft.com/office/word/2010/wordprocessingGroup" xmlns:wpi="http://schemas.microsoft.com/office/word/2010/wordprocessingInk" xmlns:wne="http://schemas.microsoft.com/office/word/2006/wordml" xmlns:wps="http://schemas.microsoft.com/office/word/2010/wordprocessingShape" mc:Ignorable="w14 w15 w16se w16cid w16 w16cex w16sdtdh wp14">
+<w:document xmlns:wpc="http://schemas.microsoft.com/office/word/2010/wordprocessingCanvas" xmlns:cx="http://schemas.microsoft.com/office/drawing/2014/chartex" xmlns:cx1="http://schemas.microsoft.com/office/drawing/2015/9/8/chartex" xmlns:cx2="http://schemas.microsoft.com/office/drawing/2015/10/21/chartex" xmlns:cx3="http://schemas.microsoft.com/office/drawing/2016/5/9/chartex" xmlns:cx4="http://schemas.microsoft.com/office/drawing/2016/5/10/chartex" xmlns:cx5="http://schemas.microsoft.com/office/drawing/2016/5/11/chartex" xmlns:cx6="http://schemas.microsoft.com/office/drawing/2016/5/12/chartex" xmlns:cx7="http://schemas.microsoft.com/office/drawing/2016/5/13/chartex" xmlns:cx8="http://schemas.microsoft.com/office/drawing/2016/5/14/chartex" xmlns:mc="http://schemas.openxmlformats.org/markup-compatibility/2006" xmlns:aink="http://schemas.microsoft.com/office/drawing/2016/ink" xmlns:am3d="http://schemas.microsoft.com/office/drawing/2017/model3d" xmlns:o="urn:schemas-microsoft-com:office:office" xmlns:oel="http://schemas.microsoft.com/office/2019/extlst" xmlns:r="http://schemas.openxmlformats.org/officeDocument/2006/relationships" xmlns:m="http://schemas.openxmlformats.org/officeDocument/2006/math" xmlns:v="urn:schemas-microsoft-com:vml" xmlns:wp14="http://schemas.microsoft.com/office/word/2010/wordprocessingDrawing" xmlns:wp="http://schemas.openxmlformats.org/drawingml/2006/wordprocessingDrawing" xmlns:w10="urn:schemas-microsoft-com:office:word" xmlns:w="http://schemas.openxmlformats.org/wordprocessingml/2006/main" xmlns:w14="http://schemas.microsoft.com/office/word/2010/wordml" xmlns:w15="http://schemas.microsoft.com/office/word/2012/wordml" xmlns:w16cex="http://schemas.microsoft.com/office/word/2018/wordml/cex" xmlns:w16cid="http://schemas.microsoft.com/office/word/2016/wordml/cid" xmlns:w16="http://schemas.microsoft.com/office/word/2018/wordml" xmlns:w16sdtdh="http://schemas.microsoft.com/office/word/2020/wordml/sdtdatahash" xmlns:w16se="http://schemas.microsoft.com/office/word/2015/wordml/symex" xmlns:wpg="http://schemas.microsoft.com/office/word/2010/wordprocessingGroup" xmlns:wpi="http://schemas.microsoft.com/office/word/2010/wordprocessingInk" xmlns:wne="http://schemas.microsoft.com/office/word/2006/wordml" xmlns:wps="http://schemas.microsoft.com/office/word/2010/wordprocessingShape" mc:Ignorable="w14 w15 w16se w16cid w16 w16cex w16sdtdh wp14">
   <w:body>
     <w:p>
       <w:pPr>
         <w:jc w:val="center"/>
         <w:rPr>
-          <w:rFonts w:ascii="楷体" w:eastAsia="楷体" w:hAnsi="楷体"/>
+          <w:rFonts w:ascii="汇文明朝体" w:eastAsia="汇文明朝体" w:hAnsi="汇文明朝体"/>
           <w:sz w:val="32"/>
           <w:szCs w:val="32"/>
         </w:rPr>
       </w:pPr>
       <w:r>
         <w:rPr>
-          <w:rFonts w:ascii="楷体" w:eastAsia="楷体" w:hAnsi="楷体"/>
+          <w:rFonts w:ascii="汇文明朝体" w:eastAsia="汇文明朝体" w:hAnsi="汇文明朝体"/>
           <w:sz w:val="32"/>
           <w:szCs w:val="32"/>
         </w:rPr>
@@ -32,6 +32,7 @@
       <w:r>
         <w:rPr>
           <w:rFonts w:ascii="楷体" w:eastAsia="楷体" w:hAnsi="楷体"/>
+          <w:noProof/>
           <w:sz w:val="32"/>
           <w:szCs w:val="32"/>
         </w:rPr>
@@ -3623,7 +3624,7 @@
       <w:pPr>
         <w:jc w:val="center"/>
         <w:rPr>
-          <w:rFonts w:ascii="楷体" w:eastAsia="楷体" w:hAnsi="楷体"/>
+          <w:rFonts w:ascii="汇文明朝体" w:eastAsia="汇文明朝体" w:hAnsi="汇文明朝体"/>
           <w:sz w:val="32"/>
           <w:szCs w:val="32"/>
         </w:rPr>
@@ -3633,14 +3634,14 @@
       <w:pPr>
         <w:jc w:val="center"/>
         <w:rPr>
-          <w:rFonts w:ascii="楷体" w:eastAsia="楷体" w:hAnsi="楷体"/>
+          <w:rFonts w:ascii="汇文明朝体" w:eastAsia="汇文明朝体" w:hAnsi="汇文明朝体"/>
           <w:sz w:val="32"/>
           <w:szCs w:val="32"/>
         </w:rPr>
       </w:pPr>
       <w:r>
         <w:rPr>
-          <w:rFonts w:ascii="楷体" w:eastAsia="楷体" w:hAnsi="楷体"/>
+          <w:rFonts w:ascii="汇文明朝体" w:eastAsia="汇文明朝体" w:hAnsi="汇文明朝体"/>
           <w:sz w:val="32"/>
           <w:szCs w:val="32"/>
         </w:rPr>
@@ -3648,7 +3649,7 @@
       </w:r>
       <w:r>
         <w:rPr>
-          <w:rFonts w:ascii="楷体" w:eastAsia="楷体" w:hAnsi="楷体" w:hint="eastAsia"/>
+          <w:rFonts w:ascii="汇文明朝体" w:eastAsia="汇文明朝体" w:hAnsi="汇文明朝体" w:hint="eastAsia"/>
           <w:sz w:val="32"/>
           <w:szCs w:val="32"/>
         </w:rPr>
@@ -3656,7 +3657,7 @@
       </w:r>
       <w:r>
         <w:rPr>
-          <w:rFonts w:ascii="楷体" w:eastAsia="楷体" w:hAnsi="楷体"/>
+          <w:rFonts w:ascii="汇文明朝体" w:eastAsia="汇文明朝体" w:hAnsi="汇文明朝体"/>
           <w:sz w:val="32"/>
           <w:szCs w:val="32"/>
         </w:rPr>
@@ -3664,7 +3665,7 @@
       </w:r>
       <w:r>
         <w:rPr>
-          <w:rFonts w:ascii="楷体" w:eastAsia="楷体" w:hAnsi="楷体" w:hint="eastAsia"/>
+          <w:rFonts w:ascii="汇文明朝体" w:eastAsia="汇文明朝体" w:hAnsi="汇文明朝体" w:hint="eastAsia"/>
           <w:sz w:val="32"/>
           <w:szCs w:val="32"/>
         </w:rPr>
@@ -3672,7 +3673,7 @@
       </w:r>
       <w:r>
         <w:rPr>
-          <w:rFonts w:ascii="楷体" w:eastAsia="楷体" w:hAnsi="楷体"/>
+          <w:rFonts w:ascii="汇文明朝体" w:eastAsia="汇文明朝体" w:hAnsi="汇文明朝体"/>
           <w:sz w:val="32"/>
           <w:szCs w:val="32"/>
         </w:rPr>
@@ -3683,14 +3684,14 @@
       <w:pPr>
         <w:jc w:val="center"/>
         <w:rPr>
-          <w:rFonts w:ascii="楷体" w:eastAsia="楷体" w:hAnsi="楷体" w:hint="eastAsia"/>
+          <w:rFonts w:ascii="汇文明朝体" w:eastAsia="汇文明朝体" w:hAnsi="汇文明朝体"/>
           <w:sz w:val="32"/>
           <w:szCs w:val="32"/>
         </w:rPr>
       </w:pPr>
       <w:r>
         <w:rPr>
-          <w:rFonts w:ascii="楷体" w:eastAsia="楷体" w:hAnsi="楷体"/>
+          <w:rFonts w:ascii="汇文明朝体" w:eastAsia="汇文明朝体" w:hAnsi="汇文明朝体"/>
           <w:sz w:val="32"/>
           <w:szCs w:val="32"/>
         </w:rPr>
@@ -3698,7 +3699,7 @@
       </w:r>
       <w:r>
         <w:rPr>
-          <w:rFonts w:ascii="楷体" w:eastAsia="楷体" w:hAnsi="楷体" w:hint="eastAsia"/>
+          <w:rFonts w:ascii="汇文明朝体" w:eastAsia="汇文明朝体" w:hAnsi="汇文明朝体" w:hint="eastAsia"/>
           <w:sz w:val="32"/>
           <w:szCs w:val="32"/>
         </w:rPr>
@@ -3706,7 +3707,7 @@
       </w:r>
       <w:r>
         <w:rPr>
-          <w:rFonts w:ascii="楷体" w:eastAsia="楷体" w:hAnsi="楷体"/>
+          <w:rFonts w:ascii="汇文明朝体" w:eastAsia="汇文明朝体" w:hAnsi="汇文明朝体"/>
           <w:sz w:val="32"/>
           <w:szCs w:val="32"/>
         </w:rPr>
@@ -3714,7 +3715,7 @@
       </w:r>
       <w:r>
         <w:rPr>
-          <w:rFonts w:ascii="楷体" w:eastAsia="楷体" w:hAnsi="楷体" w:hint="eastAsia"/>
+          <w:rFonts w:ascii="汇文明朝体" w:eastAsia="汇文明朝体" w:hAnsi="汇文明朝体" w:hint="eastAsia"/>
           <w:sz w:val="32"/>
           <w:szCs w:val="32"/>
         </w:rPr>
@@ -3722,7 +3723,7 @@
       </w:r>
       <w:r>
         <w:rPr>
-          <w:rFonts w:ascii="楷体" w:eastAsia="楷体" w:hAnsi="楷体"/>
+          <w:rFonts w:ascii="汇文明朝体" w:eastAsia="汇文明朝体" w:hAnsi="汇文明朝体"/>
           <w:sz w:val="32"/>
           <w:szCs w:val="32"/>
         </w:rPr>
@@ -3730,7 +3731,7 @@
       </w:r>
       <w:r>
         <w:rPr>
-          <w:rFonts w:ascii="楷体" w:eastAsia="楷体" w:hAnsi="楷体" w:hint="eastAsia"/>
+          <w:rFonts w:ascii="汇文明朝体" w:eastAsia="汇文明朝体" w:hAnsi="汇文明朝体" w:hint="eastAsia"/>
           <w:sz w:val="32"/>
           <w:szCs w:val="32"/>
         </w:rPr>
@@ -3738,7 +3739,7 @@
       </w:r>
       <w:r>
         <w:rPr>
-          <w:rFonts w:ascii="楷体" w:eastAsia="楷体" w:hAnsi="楷体"/>
+          <w:rFonts w:ascii="汇文明朝体" w:eastAsia="汇文明朝体" w:hAnsi="汇文明朝体"/>
           <w:sz w:val="32"/>
           <w:szCs w:val="32"/>
         </w:rPr>
@@ -3749,14 +3750,14 @@
       <w:pPr>
         <w:ind w:firstLineChars="700" w:firstLine="2240"/>
         <w:rPr>
-          <w:rFonts w:ascii="楷体" w:eastAsia="楷体" w:hAnsi="楷体" w:hint="eastAsia"/>
+          <w:rFonts w:ascii="汇文明朝体" w:eastAsia="汇文明朝体" w:hAnsi="汇文明朝体"/>
           <w:sz w:val="32"/>
           <w:szCs w:val="32"/>
         </w:rPr>
       </w:pPr>
       <w:r>
         <w:rPr>
-          <w:rFonts w:ascii="楷体" w:eastAsia="楷体" w:hAnsi="楷体"/>
+          <w:rFonts w:ascii="汇文明朝体" w:eastAsia="汇文明朝体" w:hAnsi="汇文明朝体"/>
           <w:sz w:val="32"/>
           <w:szCs w:val="32"/>
         </w:rPr>
@@ -3764,7 +3765,7 @@
       </w:r>
       <w:r>
         <w:rPr>
-          <w:rFonts w:ascii="楷体" w:eastAsia="楷体" w:hAnsi="楷体" w:hint="eastAsia"/>
+          <w:rFonts w:ascii="汇文明朝体" w:eastAsia="汇文明朝体" w:hAnsi="汇文明朝体" w:hint="eastAsia"/>
           <w:sz w:val="32"/>
           <w:szCs w:val="32"/>
         </w:rPr>
@@ -3775,7 +3776,7 @@
       <w:pPr>
         <w:jc w:val="center"/>
         <w:rPr>
-          <w:rFonts w:ascii="楷体" w:eastAsia="楷体" w:hAnsi="楷体" w:hint="eastAsia"/>
+          <w:rFonts w:ascii="楷体" w:eastAsia="楷体" w:hAnsi="楷体"/>
           <w:sz w:val="32"/>
           <w:szCs w:val="32"/>
         </w:rPr>
@@ -3789,6 +3790,44 @@
     </w:sectPr>
   </w:body>
 </w:document>
+</file>
+
+<file path=word/endnotes.xml><?xml version="1.0" encoding="utf-8"?>
+<w:endnotes xmlns:wpc="http://schemas.microsoft.com/office/word/2010/wordprocessingCanvas" xmlns:cx="http://schemas.microsoft.com/office/drawing/2014/chartex" xmlns:cx1="http://schemas.microsoft.com/office/drawing/2015/9/8/chartex" xmlns:cx2="http://schemas.microsoft.com/office/drawing/2015/10/21/chartex" xmlns:cx3="http://schemas.microsoft.com/office/drawing/2016/5/9/chartex" xmlns:cx4="http://schemas.microsoft.com/office/drawing/2016/5/10/chartex" xmlns:cx5="http://schemas.microsoft.com/office/drawing/2016/5/11/chartex" xmlns:cx6="http://schemas.microsoft.com/office/drawing/2016/5/12/chartex" xmlns:cx7="http://schemas.microsoft.com/office/drawing/2016/5/13/chartex" xmlns:cx8="http://schemas.microsoft.com/office/drawing/2016/5/14/chartex" xmlns:mc="http://schemas.openxmlformats.org/markup-compatibility/2006" xmlns:aink="http://schemas.microsoft.com/office/drawing/2016/ink" xmlns:am3d="http://schemas.microsoft.com/office/drawing/2017/model3d" xmlns:o="urn:schemas-microsoft-com:office:office" xmlns:oel="http://schemas.microsoft.com/office/2019/extlst" xmlns:r="http://schemas.openxmlformats.org/officeDocument/2006/relationships" xmlns:m="http://schemas.openxmlformats.org/officeDocument/2006/math" xmlns:v="urn:schemas-microsoft-com:vml" xmlns:wp14="http://schemas.microsoft.com/office/word/2010/wordprocessingDrawing" xmlns:wp="http://schemas.openxmlformats.org/drawingml/2006/wordprocessingDrawing" xmlns:w10="urn:schemas-microsoft-com:office:word" xmlns:w="http://schemas.openxmlformats.org/wordprocessingml/2006/main" xmlns:w14="http://schemas.microsoft.com/office/word/2010/wordml" xmlns:w15="http://schemas.microsoft.com/office/word/2012/wordml" xmlns:w16cex="http://schemas.microsoft.com/office/word/2018/wordml/cex" xmlns:w16cid="http://schemas.microsoft.com/office/word/2016/wordml/cid" xmlns:w16="http://schemas.microsoft.com/office/word/2018/wordml" xmlns:w16sdtdh="http://schemas.microsoft.com/office/word/2020/wordml/sdtdatahash" xmlns:w16se="http://schemas.microsoft.com/office/word/2015/wordml/symex" xmlns:wpg="http://schemas.microsoft.com/office/word/2010/wordprocessingGroup" xmlns:wpi="http://schemas.microsoft.com/office/word/2010/wordprocessingInk" xmlns:wne="http://schemas.microsoft.com/office/word/2006/wordml" xmlns:wps="http://schemas.microsoft.com/office/word/2010/wordprocessingShape" mc:Ignorable="w14 w15 w16se w16cid w16 w16cex w16sdtdh wp14">
+  <w:endnote w:type="separator" w:id="-1">
+    <w:p>
+      <w:r>
+        <w:separator/>
+      </w:r>
+    </w:p>
+  </w:endnote>
+  <w:endnote w:type="continuationSeparator" w:id="0">
+    <w:p>
+      <w:r>
+        <w:continuationSeparator/>
+      </w:r>
+    </w:p>
+  </w:endnote>
+</w:endnotes>
+</file>
+
+<file path=word/footnotes.xml><?xml version="1.0" encoding="utf-8"?>
+<w:footnotes xmlns:wpc="http://schemas.microsoft.com/office/word/2010/wordprocessingCanvas" xmlns:cx="http://schemas.microsoft.com/office/drawing/2014/chartex" xmlns:cx1="http://schemas.microsoft.com/office/drawing/2015/9/8/chartex" xmlns:cx2="http://schemas.microsoft.com/office/drawing/2015/10/21/chartex" xmlns:cx3="http://schemas.microsoft.com/office/drawing/2016/5/9/chartex" xmlns:cx4="http://schemas.microsoft.com/office/drawing/2016/5/10/chartex" xmlns:cx5="http://schemas.microsoft.com/office/drawing/2016/5/11/chartex" xmlns:cx6="http://schemas.microsoft.com/office/drawing/2016/5/12/chartex" xmlns:cx7="http://schemas.microsoft.com/office/drawing/2016/5/13/chartex" xmlns:cx8="http://schemas.microsoft.com/office/drawing/2016/5/14/chartex" xmlns:mc="http://schemas.openxmlformats.org/markup-compatibility/2006" xmlns:aink="http://schemas.microsoft.com/office/drawing/2016/ink" xmlns:am3d="http://schemas.microsoft.com/office/drawing/2017/model3d" xmlns:o="urn:schemas-microsoft-com:office:office" xmlns:oel="http://schemas.microsoft.com/office/2019/extlst" xmlns:r="http://schemas.openxmlformats.org/officeDocument/2006/relationships" xmlns:m="http://schemas.openxmlformats.org/officeDocument/2006/math" xmlns:v="urn:schemas-microsoft-com:vml" xmlns:wp14="http://schemas.microsoft.com/office/word/2010/wordprocessingDrawing" xmlns:wp="http://schemas.openxmlformats.org/drawingml/2006/wordprocessingDrawing" xmlns:w10="urn:schemas-microsoft-com:office:word" xmlns:w="http://schemas.openxmlformats.org/wordprocessingml/2006/main" xmlns:w14="http://schemas.microsoft.com/office/word/2010/wordml" xmlns:w15="http://schemas.microsoft.com/office/word/2012/wordml" xmlns:w16cex="http://schemas.microsoft.com/office/word/2018/wordml/cex" xmlns:w16cid="http://schemas.microsoft.com/office/word/2016/wordml/cid" xmlns:w16="http://schemas.microsoft.com/office/word/2018/wordml" xmlns:w16sdtdh="http://schemas.microsoft.com/office/word/2020/wordml/sdtdatahash" xmlns:w16se="http://schemas.microsoft.com/office/word/2015/wordml/symex" xmlns:wpg="http://schemas.microsoft.com/office/word/2010/wordprocessingGroup" xmlns:wpi="http://schemas.microsoft.com/office/word/2010/wordprocessingInk" xmlns:wne="http://schemas.microsoft.com/office/word/2006/wordml" xmlns:wps="http://schemas.microsoft.com/office/word/2010/wordprocessingShape" mc:Ignorable="w14 w15 w16se w16cid w16 w16cex w16sdtdh wp14">
+  <w:footnote w:type="separator" w:id="-1">
+    <w:p>
+      <w:r>
+        <w:separator/>
+      </w:r>
+    </w:p>
+  </w:footnote>
+  <w:footnote w:type="continuationSeparator" w:id="0">
+    <w:p>
+      <w:r>
+        <w:continuationSeparator/>
+      </w:r>
+    </w:p>
+  </w:footnote>
+</w:footnotes>
 </file>
 
 <file path=word/styles.xml><?xml version="1.0" encoding="utf-8"?>
@@ -3911,6 +3950,7 @@
     <w:lsdException w:name="HTML Sample" w:semiHidden="1" w:unhideWhenUsed="1"/>
     <w:lsdException w:name="HTML Typewriter" w:semiHidden="1" w:unhideWhenUsed="1"/>
     <w:lsdException w:name="HTML Variable" w:semiHidden="1" w:unhideWhenUsed="1"/>
+    <w:lsdException w:name="Normal Table" w:semiHidden="1" w:unhideWhenUsed="1"/>
     <w:lsdException w:name="annotation subject" w:semiHidden="1" w:unhideWhenUsed="1"/>
     <w:lsdException w:name="No List" w:semiHidden="1" w:unhideWhenUsed="1"/>
     <w:lsdException w:name="Outline List 1" w:semiHidden="1" w:unhideWhenUsed="1"/>
@@ -3957,8 +3997,10 @@
     <w:lsdException w:name="Table Subtle 2" w:semiHidden="1" w:unhideWhenUsed="1"/>
     <w:lsdException w:name="Table Web 1" w:semiHidden="1" w:unhideWhenUsed="1"/>
     <w:lsdException w:name="Table Web 2" w:semiHidden="1" w:unhideWhenUsed="1"/>
+    <w:lsdException w:name="Table Web 3" w:semiHidden="1" w:unhideWhenUsed="1"/>
     <w:lsdException w:name="Balloon Text" w:semiHidden="1" w:unhideWhenUsed="1"/>
     <w:lsdException w:name="Table Grid" w:uiPriority="39"/>
+    <w:lsdException w:name="Table Theme" w:semiHidden="1" w:unhideWhenUsed="1"/>
     <w:lsdException w:name="Placeholder Text" w:semiHidden="1"/>
     <w:lsdException w:name="No Spacing" w:uiPriority="1" w:qFormat="1"/>
     <w:lsdException w:name="Light Shading" w:uiPriority="60"/>
@@ -4214,6 +4256,71 @@
     <w:uiPriority w:val="99"/>
     <w:semiHidden/>
     <w:unhideWhenUsed/>
+  </w:style>
+  <w:style w:type="paragraph" w:styleId="a3">
+    <w:name w:val="header"/>
+    <w:basedOn w:val="a"/>
+    <w:link w:val="a4"/>
+    <w:uiPriority w:val="99"/>
+    <w:unhideWhenUsed/>
+    <w:rsid w:val="00B91344"/>
+    <w:pPr>
+      <w:pBdr>
+        <w:bottom w:val="single" w:sz="6" w:space="1" w:color="auto"/>
+      </w:pBdr>
+      <w:tabs>
+        <w:tab w:val="center" w:pos="4153"/>
+        <w:tab w:val="right" w:pos="8306"/>
+      </w:tabs>
+      <w:snapToGrid w:val="0"/>
+      <w:jc w:val="center"/>
+    </w:pPr>
+    <w:rPr>
+      <w:sz w:val="18"/>
+      <w:szCs w:val="18"/>
+    </w:rPr>
+  </w:style>
+  <w:style w:type="character" w:customStyle="1" w:styleId="a4">
+    <w:name w:val="页眉 字符"/>
+    <w:basedOn w:val="a0"/>
+    <w:link w:val="a3"/>
+    <w:uiPriority w:val="99"/>
+    <w:rsid w:val="00B91344"/>
+    <w:rPr>
+      <w:sz w:val="18"/>
+      <w:szCs w:val="18"/>
+    </w:rPr>
+  </w:style>
+  <w:style w:type="paragraph" w:styleId="a5">
+    <w:name w:val="footer"/>
+    <w:basedOn w:val="a"/>
+    <w:link w:val="a6"/>
+    <w:uiPriority w:val="99"/>
+    <w:unhideWhenUsed/>
+    <w:rsid w:val="00B91344"/>
+    <w:pPr>
+      <w:tabs>
+        <w:tab w:val="center" w:pos="4153"/>
+        <w:tab w:val="right" w:pos="8306"/>
+      </w:tabs>
+      <w:snapToGrid w:val="0"/>
+      <w:jc w:val="left"/>
+    </w:pPr>
+    <w:rPr>
+      <w:sz w:val="18"/>
+      <w:szCs w:val="18"/>
+    </w:rPr>
+  </w:style>
+  <w:style w:type="character" w:customStyle="1" w:styleId="a6">
+    <w:name w:val="页脚 字符"/>
+    <w:basedOn w:val="a0"/>
+    <w:link w:val="a5"/>
+    <w:uiPriority w:val="99"/>
+    <w:rsid w:val="00B91344"/>
+    <w:rPr>
+      <w:sz w:val="18"/>
+      <w:szCs w:val="18"/>
+    </w:rPr>
   </w:style>
 </w:styles>
 </file>

</xml_diff>